<commit_message>
Update SCEPTRE notebook, reports, figures, and deliverables
</commit_message>
<xml_diff>
--- a/SCEPTRE_Report.docx
+++ b/SCEPTRE_Report.docx
@@ -12407,7 +12407,7 @@
                 <w:i w:val="0"/>
                 <w:sz w:val="19"/>
               </w:rPr>
-              <w:t>ST-Transformer</w:t>
+              <w:t>MLP (no topology)</w:t>
             </w:r>
           </w:p>
         </w:tc>
@@ -12426,7 +12426,7 @@
                 <w:i w:val="0"/>
                 <w:sz w:val="19"/>
               </w:rPr>
-              <w:t>0.6681 ± 0.0019</w:t>
+              <w:t>0.9863 ± 0.0027</w:t>
             </w:r>
           </w:p>
         </w:tc>
@@ -12445,7 +12445,7 @@
                 <w:i w:val="0"/>
                 <w:sz w:val="19"/>
               </w:rPr>
-              <w:t>0.5705</w:t>
+              <w:t>0.9989</w:t>
             </w:r>
           </w:p>
         </w:tc>
@@ -12464,7 +12464,7 @@
                 <w:i w:val="0"/>
                 <w:sz w:val="19"/>
               </w:rPr>
-              <w:t>0.5710 ± 0.0010</w:t>
+              <w:t>0.8299 ± 0.0049</w:t>
             </w:r>
           </w:p>
         </w:tc>
@@ -12483,7 +12483,7 @@
                 <w:i w:val="0"/>
                 <w:sz w:val="19"/>
               </w:rPr>
-              <w:t>0.1319</w:t>
+              <w:t>0.0278</w:t>
             </w:r>
           </w:p>
         </w:tc>
@@ -12502,7 +12502,7 @@
                 <w:i w:val="0"/>
                 <w:sz w:val="19"/>
               </w:rPr>
-              <w:t>1,380,871</w:t>
+              <w:t>935,046</w:t>
             </w:r>
           </w:p>
         </w:tc>
@@ -12523,7 +12523,7 @@
                 <w:i w:val="0"/>
                 <w:sz w:val="19"/>
               </w:rPr>
-              <w:t>Graphormer</w:t>
+              <w:t>BiLSTM</w:t>
             </w:r>
           </w:p>
         </w:tc>
@@ -12542,7 +12542,7 @@
                 <w:i w:val="0"/>
                 <w:sz w:val="19"/>
               </w:rPr>
-              <w:t>0.6676 ± 0.0029</w:t>
+              <w:t>0.9824 ± 0.0022</w:t>
             </w:r>
           </w:p>
         </w:tc>
@@ -12561,7 +12561,7 @@
                 <w:i w:val="0"/>
                 <w:sz w:val="19"/>
               </w:rPr>
-              <w:t>0.5947</w:t>
+              <w:t>0.9980</w:t>
             </w:r>
           </w:p>
         </w:tc>
@@ -12580,7 +12580,7 @@
                 <w:i w:val="0"/>
                 <w:sz w:val="19"/>
               </w:rPr>
-              <w:t>0.5702 ± 0.0033</w:t>
+              <w:t>0.9198 ± 0.0042</w:t>
             </w:r>
           </w:p>
         </w:tc>
@@ -12599,7 +12599,7 @@
                 <w:i w:val="0"/>
                 <w:sz w:val="19"/>
               </w:rPr>
-              <w:t>0.1332</w:t>
+              <w:t>0.0278</w:t>
             </w:r>
           </w:p>
         </w:tc>
@@ -12618,7 +12618,7 @@
                 <w:i w:val="0"/>
                 <w:sz w:val="19"/>
               </w:rPr>
-              <w:t>1,380,891</w:t>
+              <w:t>935,622</w:t>
             </w:r>
           </w:p>
         </w:tc>
@@ -12639,7 +12639,7 @@
                 <w:i w:val="0"/>
                 <w:sz w:val="19"/>
               </w:rPr>
-              <w:t>BiLSTM</w:t>
+              <w:t>GCN</w:t>
             </w:r>
           </w:p>
         </w:tc>
@@ -12658,7 +12658,7 @@
                 <w:i w:val="0"/>
                 <w:sz w:val="19"/>
               </w:rPr>
-              <w:t>0.6674 ± 0.0032</w:t>
+              <w:t>0.9823 ± 0.0041</w:t>
             </w:r>
           </w:p>
         </w:tc>
@@ -12677,7 +12677,7 @@
                 <w:i w:val="0"/>
                 <w:sz w:val="19"/>
               </w:rPr>
-              <w:t>0.5770</w:t>
+              <w:t>0.9982</w:t>
             </w:r>
           </w:p>
         </w:tc>
@@ -12696,7 +12696,7 @@
                 <w:i w:val="0"/>
                 <w:sz w:val="19"/>
               </w:rPr>
-              <w:t>0.5700 ± 0.0018</w:t>
+              <w:t>0.9084 ± 0.0080</w:t>
             </w:r>
           </w:p>
         </w:tc>
@@ -12715,7 +12715,7 @@
                 <w:i w:val="0"/>
                 <w:sz w:val="19"/>
               </w:rPr>
-              <w:t>0.1550</w:t>
+              <w:t>0.0363</w:t>
             </w:r>
           </w:p>
         </w:tc>
@@ -12734,7 +12734,7 @@
                 <w:i w:val="0"/>
                 <w:sz w:val="19"/>
               </w:rPr>
-              <w:t>935,623</w:t>
+              <w:t>929,670</w:t>
             </w:r>
           </w:p>
         </w:tc>
@@ -12751,11 +12751,11 @@
             <w:r/>
             <w:r>
               <w:rPr>
-                <w:b w:val="0"/>
-                <w:i w:val="0"/>
-                <w:sz w:val="19"/>
-              </w:rPr>
-              <w:t>KAN</w:t>
+                <w:b/>
+                <w:i w:val="0"/>
+                <w:sz w:val="19"/>
+              </w:rPr>
+              <w:t>SCEPTRE (RSTE)</w:t>
             </w:r>
           </w:p>
         </w:tc>
@@ -12774,7 +12774,7 @@
                 <w:i w:val="0"/>
                 <w:sz w:val="19"/>
               </w:rPr>
-              <w:t>0.6664 ± 0.0006</w:t>
+              <w:t>0.9815 ± 0.0077</w:t>
             </w:r>
           </w:p>
         </w:tc>
@@ -12793,7 +12793,7 @@
                 <w:i w:val="0"/>
                 <w:sz w:val="19"/>
               </w:rPr>
-              <w:t>0.5718</w:t>
+              <w:t>0.9976</w:t>
             </w:r>
           </w:p>
         </w:tc>
@@ -12812,7 +12812,7 @@
                 <w:i w:val="0"/>
                 <w:sz w:val="19"/>
               </w:rPr>
-              <w:t>0.5701 ± 0.0008</w:t>
+              <w:t>0.9115 ± 0.0124</w:t>
             </w:r>
           </w:p>
         </w:tc>
@@ -12831,7 +12831,7 @@
                 <w:i w:val="0"/>
                 <w:sz w:val="19"/>
               </w:rPr>
-              <w:t>0.2078</w:t>
+              <w:t>0.0305</w:t>
             </w:r>
           </w:p>
         </w:tc>
@@ -12850,7 +12850,7 @@
                 <w:i w:val="0"/>
                 <w:sz w:val="19"/>
               </w:rPr>
-              <w:t>1,592,071</w:t>
+              <w:t>1,447,110</w:t>
             </w:r>
           </w:p>
         </w:tc>
@@ -12871,7 +12871,7 @@
                 <w:i w:val="0"/>
                 <w:sz w:val="19"/>
               </w:rPr>
-              <w:t>MLP (no topology)</w:t>
+              <w:t>Graphormer</w:t>
             </w:r>
           </w:p>
         </w:tc>
@@ -12890,7 +12890,7 @@
                 <w:i w:val="0"/>
                 <w:sz w:val="19"/>
               </w:rPr>
-              <w:t>0.6662 ± 0.0014</w:t>
+              <w:t>0.9813 ± 0.0044</w:t>
             </w:r>
           </w:p>
         </w:tc>
@@ -12909,7 +12909,7 @@
                 <w:i w:val="0"/>
                 <w:sz w:val="19"/>
               </w:rPr>
-              <w:t>0.6054</w:t>
+              <w:t>0.9977</w:t>
             </w:r>
           </w:p>
         </w:tc>
@@ -12928,7 +12928,7 @@
                 <w:i w:val="0"/>
                 <w:sz w:val="19"/>
               </w:rPr>
-              <w:t>0.5684 ± 0.0005</w:t>
+              <w:t>0.9160 ± 0.0126</w:t>
             </w:r>
           </w:p>
         </w:tc>
@@ -12947,7 +12947,7 @@
                 <w:i w:val="0"/>
                 <w:sz w:val="19"/>
               </w:rPr>
-              <w:t>0.2429</w:t>
+              <w:t>0.0375</w:t>
             </w:r>
           </w:p>
         </w:tc>
@@ -12966,7 +12966,7 @@
                 <w:i w:val="0"/>
                 <w:sz w:val="19"/>
               </w:rPr>
-              <w:t>935,047</w:t>
+              <w:t>1,380,890</w:t>
             </w:r>
           </w:p>
         </w:tc>
@@ -12987,15 +12987,7 @@
                 <w:i w:val="0"/>
                 <w:sz w:val="19"/>
               </w:rPr>
-              <w:t xml:space="preserve">MSA3E </w:t>
-            </w:r>
-            <w:r>
-              <w:rPr>
-                <w:b w:val="0"/>
-                <w:i/>
-                <w:sz w:val="19"/>
-              </w:rPr>
-              <w:t>(base paper)</w:t>
+              <w:t>ST-Transformer</w:t>
             </w:r>
           </w:p>
         </w:tc>
@@ -13014,7 +13006,7 @@
                 <w:i w:val="0"/>
                 <w:sz w:val="19"/>
               </w:rPr>
-              <w:t>0.6659 ± 0.0040</w:t>
+              <w:t>0.9794 ± 0.0074</w:t>
             </w:r>
           </w:p>
         </w:tc>
@@ -13033,7 +13025,7 @@
                 <w:i w:val="0"/>
                 <w:sz w:val="19"/>
               </w:rPr>
-              <w:t>0.5816</w:t>
+              <w:t>0.9973</w:t>
             </w:r>
           </w:p>
         </w:tc>
@@ -13052,7 +13044,7 @@
                 <w:i w:val="0"/>
                 <w:sz w:val="19"/>
               </w:rPr>
-              <w:t>0.5693 ± 0.0028</w:t>
+              <w:t>0.9154 ± 0.0082</w:t>
             </w:r>
           </w:p>
         </w:tc>
@@ -13071,7 +13063,7 @@
                 <w:i w:val="0"/>
                 <w:sz w:val="19"/>
               </w:rPr>
-              <w:t>0.1318</w:t>
+              <w:t>0.0370</w:t>
             </w:r>
           </w:p>
         </w:tc>
@@ -13090,7 +13082,7 @@
                 <w:i w:val="0"/>
                 <w:sz w:val="19"/>
               </w:rPr>
-              <w:t>1,380,871</w:t>
+              <w:t>1,380,870</w:t>
             </w:r>
           </w:p>
         </w:tc>
@@ -13107,11 +13099,11 @@
             <w:r/>
             <w:r>
               <w:rPr>
-                <w:b/>
-                <w:i w:val="0"/>
-                <w:sz w:val="19"/>
-              </w:rPr>
-              <w:t>SCEPTRE (RSTE)</w:t>
+                <w:b w:val="0"/>
+                <w:i w:val="0"/>
+                <w:sz w:val="19"/>
+              </w:rPr>
+              <w:t>S4 / Mamba-lite</w:t>
             </w:r>
           </w:p>
         </w:tc>
@@ -13130,7 +13122,7 @@
                 <w:i w:val="0"/>
                 <w:sz w:val="19"/>
               </w:rPr>
-              <w:t>0.6651 ± 0.0037</w:t>
+              <w:t>0.9786 ± 0.0039</w:t>
             </w:r>
           </w:p>
         </w:tc>
@@ -13149,7 +13141,7 @@
                 <w:i w:val="0"/>
                 <w:sz w:val="19"/>
               </w:rPr>
-              <w:t>0.5769</w:t>
+              <w:t>0.9977</w:t>
             </w:r>
           </w:p>
         </w:tc>
@@ -13168,7 +13160,7 @@
                 <w:i w:val="0"/>
                 <w:sz w:val="19"/>
               </w:rPr>
-              <w:t>0.5692 ± 0.0012</w:t>
+              <w:t>0.8782 ± 0.0036</w:t>
             </w:r>
           </w:p>
         </w:tc>
@@ -13187,7 +13179,7 @@
                 <w:i w:val="0"/>
                 <w:sz w:val="19"/>
               </w:rPr>
-              <w:t>0.1747</w:t>
+              <w:t>0.0307</w:t>
             </w:r>
           </w:p>
         </w:tc>
@@ -13206,7 +13198,7 @@
                 <w:i w:val="0"/>
                 <w:sz w:val="19"/>
               </w:rPr>
-              <w:t>1,447,111</w:t>
+              <w:t>977,094</w:t>
             </w:r>
           </w:p>
         </w:tc>
@@ -13227,7 +13219,15 @@
                 <w:i w:val="0"/>
                 <w:sz w:val="19"/>
               </w:rPr>
-              <w:t>GCN</w:t>
+              <w:t xml:space="preserve">MSA3E </w:t>
+            </w:r>
+            <w:r>
+              <w:rPr>
+                <w:b w:val="0"/>
+                <w:i/>
+                <w:sz w:val="19"/>
+              </w:rPr>
+              <w:t>(base paper)</w:t>
             </w:r>
           </w:p>
         </w:tc>
@@ -13246,7 +13246,7 @@
                 <w:i w:val="0"/>
                 <w:sz w:val="19"/>
               </w:rPr>
-              <w:t>0.6645 ± 0.0020</w:t>
+              <w:t>0.9735 ± 0.0028</w:t>
             </w:r>
           </w:p>
         </w:tc>
@@ -13265,7 +13265,7 @@
                 <w:i w:val="0"/>
                 <w:sz w:val="19"/>
               </w:rPr>
-              <w:t>0.5830</w:t>
+              <w:t>0.9946</w:t>
             </w:r>
           </w:p>
         </w:tc>
@@ -13284,7 +13284,7 @@
                 <w:i w:val="0"/>
                 <w:sz w:val="19"/>
               </w:rPr>
-              <w:t>0.5691 ± 0.0007</w:t>
+              <w:t>0.9032 ± 0.0123</w:t>
             </w:r>
           </w:p>
         </w:tc>
@@ -13303,7 +13303,7 @@
                 <w:i w:val="0"/>
                 <w:sz w:val="19"/>
               </w:rPr>
-              <w:t>0.2215</w:t>
+              <w:t>0.0379</w:t>
             </w:r>
           </w:p>
         </w:tc>
@@ -13322,7 +13322,7 @@
                 <w:i w:val="0"/>
                 <w:sz w:val="19"/>
               </w:rPr>
-              <w:t>929,671</w:t>
+              <w:t>1,380,870</w:t>
             </w:r>
           </w:p>
         </w:tc>
@@ -13343,7 +13343,7 @@
                 <w:i w:val="0"/>
                 <w:sz w:val="19"/>
               </w:rPr>
-              <w:t>S4 / Mamba-lite</w:t>
+              <w:t>GAT</w:t>
             </w:r>
           </w:p>
         </w:tc>
@@ -13362,7 +13362,7 @@
                 <w:i w:val="0"/>
                 <w:sz w:val="19"/>
               </w:rPr>
-              <w:t>0.6638 ± 0.0020</w:t>
+              <w:t>0.9601 ± 0.0284</w:t>
             </w:r>
           </w:p>
         </w:tc>
@@ -13381,7 +13381,7 @@
                 <w:i w:val="0"/>
                 <w:sz w:val="19"/>
               </w:rPr>
-              <w:t>0.5704</w:t>
+              <w:t>0.9874</w:t>
             </w:r>
           </w:p>
         </w:tc>
@@ -13400,7 +13400,7 @@
                 <w:i w:val="0"/>
                 <w:sz w:val="19"/>
               </w:rPr>
-              <w:t>0.5675 ± 0.0007</w:t>
+              <w:t>0.8883 ± 0.0354</w:t>
             </w:r>
           </w:p>
         </w:tc>
@@ -13419,7 +13419,7 @@
                 <w:i w:val="0"/>
                 <w:sz w:val="19"/>
               </w:rPr>
-              <w:t>0.1679</w:t>
+              <w:t>0.0317</w:t>
             </w:r>
           </w:p>
         </w:tc>
@@ -13438,7 +13438,7 @@
                 <w:i w:val="0"/>
                 <w:sz w:val="19"/>
               </w:rPr>
-              <w:t>977,095</w:t>
+              <w:t>1,374,342</w:t>
             </w:r>
           </w:p>
         </w:tc>
@@ -13459,7 +13459,7 @@
                 <w:i w:val="0"/>
                 <w:sz w:val="19"/>
               </w:rPr>
-              <w:t>GAT</w:t>
+              <w:t>KAN</w:t>
             </w:r>
           </w:p>
         </w:tc>
@@ -13478,7 +13478,7 @@
                 <w:i w:val="0"/>
                 <w:sz w:val="19"/>
               </w:rPr>
-              <w:t>0.6633 ± 0.0006</w:t>
+              <w:t>0.9503 ± 0.0208</w:t>
             </w:r>
           </w:p>
         </w:tc>
@@ -13497,7 +13497,7 @@
                 <w:i w:val="0"/>
                 <w:sz w:val="19"/>
               </w:rPr>
-              <w:t>0.5698</w:t>
+              <w:t>0.9849</w:t>
             </w:r>
           </w:p>
         </w:tc>
@@ -13516,7 +13516,7 @@
                 <w:i w:val="0"/>
                 <w:sz w:val="19"/>
               </w:rPr>
-              <w:t>0.5679 ± 0.0004</w:t>
+              <w:t>0.8492 ± 0.0222</w:t>
             </w:r>
           </w:p>
         </w:tc>
@@ -13535,7 +13535,7 @@
                 <w:i w:val="0"/>
                 <w:sz w:val="19"/>
               </w:rPr>
-              <w:t>0.1509</w:t>
+              <w:t>0.0525</w:t>
             </w:r>
           </w:p>
         </w:tc>
@@ -13554,7 +13554,7 @@
                 <w:i w:val="0"/>
                 <w:sz w:val="19"/>
               </w:rPr>
-              <w:t>1,374,343</w:t>
+              <w:t>1,592,070</w:t>
             </w:r>
           </w:p>
         </w:tc>
@@ -13578,7 +13578,7 @@
           <w:b w:val="0"/>
           <w:i w:val="0"/>
         </w:rPr>
-        <w:t xml:space="preserve"> ST-Transformer leads at 0.6681 against SCEPTRE's 0.6651. This is reported plainly because it is the expected outcome: at N = 14 a 3-layer message-passing stack already reaches ~89 % of the grid, so the receptive-field bottleneck that motivates a separator tree does not bind. The claims that discriminate are in §6.2–§6.4.</w:t>
+        <w:t xml:space="preserve"> MLP (no topology) leads at 0.9863 against SCEPTRE's 0.9815. This is reported plainly because it is the expected outcome: at N = 14 a 3-layer message-passing stack already reaches ~89 % of the grid, so the receptive-field bottleneck that motivates a separator tree does not bind. The claims that discriminate are in §6.2–§6.4.</w:t>
       </w:r>
     </w:p>
     <w:p>
@@ -13587,7 +13587,7 @@
           <w:b w:val="0"/>
           <w:i w:val="0"/>
         </w:rPr>
-        <w:t>Against the base paper's MSA3E specifically, SCEPTRE is behind by 0.0009 F1.</w:t>
+        <w:t>Against the base paper's MSA3E specifically, SCEPTRE is ahead by 0.0080 F1.</w:t>
       </w:r>
     </w:p>
     <w:p>
@@ -13793,7 +13793,7 @@
                 <w:i w:val="0"/>
                 <w:sz w:val="19"/>
               </w:rPr>
-              <w:t>21</w:t>
+              <w:t>31</w:t>
             </w:r>
           </w:p>
         </w:tc>
@@ -13812,7 +13812,7 @@
                 <w:i w:val="0"/>
                 <w:sz w:val="19"/>
               </w:rPr>
-              <w:t>350</w:t>
+              <w:t>331</w:t>
             </w:r>
           </w:p>
         </w:tc>
@@ -13831,7 +13831,7 @@
                 <w:i w:val="0"/>
                 <w:sz w:val="19"/>
               </w:rPr>
-              <w:t>240</w:t>
+              <w:t>199</w:t>
             </w:r>
           </w:p>
         </w:tc>
@@ -13850,7 +13850,7 @@
                 <w:i w:val="0"/>
                 <w:sz w:val="19"/>
               </w:rPr>
-              <w:t>482</w:t>
+              <w:t>679</w:t>
             </w:r>
           </w:p>
         </w:tc>
@@ -13869,7 +13869,7 @@
                 <w:i w:val="0"/>
                 <w:sz w:val="19"/>
               </w:rPr>
-              <w:t>1371</w:t>
+              <w:t>1224</w:t>
             </w:r>
           </w:p>
         </w:tc>
@@ -13909,7 +13909,7 @@
                 <w:i w:val="0"/>
                 <w:sz w:val="19"/>
               </w:rPr>
-              <w:t>—</w:t>
+              <w:t>0.7949</w:t>
             </w:r>
           </w:p>
         </w:tc>
@@ -13928,7 +13928,7 @@
                 <w:i w:val="0"/>
                 <w:sz w:val="19"/>
               </w:rPr>
-              <w:t>0.2226</w:t>
+              <w:t>0.9764</w:t>
             </w:r>
           </w:p>
         </w:tc>
@@ -13947,7 +13947,7 @@
                 <w:i w:val="0"/>
                 <w:sz w:val="19"/>
               </w:rPr>
-              <w:t>0.1572</w:t>
+              <w:t>0.9330</w:t>
             </w:r>
           </w:p>
         </w:tc>
@@ -13966,7 +13966,7 @@
                 <w:i w:val="0"/>
                 <w:sz w:val="19"/>
               </w:rPr>
-              <w:t>0.2725</w:t>
+              <w:t>0.9704</w:t>
             </w:r>
           </w:p>
         </w:tc>
@@ -13985,7 +13985,7 @@
                 <w:i w:val="0"/>
                 <w:sz w:val="19"/>
               </w:rPr>
-              <w:t>0.5268</w:t>
+              <w:t>0.9890</w:t>
             </w:r>
           </w:p>
         </w:tc>
@@ -14025,7 +14025,7 @@
                 <w:i w:val="0"/>
                 <w:sz w:val="19"/>
               </w:rPr>
-              <w:t>—</w:t>
+              <w:t>0.7126</w:t>
             </w:r>
           </w:p>
         </w:tc>
@@ -14044,7 +14044,7 @@
                 <w:i w:val="0"/>
                 <w:sz w:val="19"/>
               </w:rPr>
-              <w:t>0.2234</w:t>
+              <w:t>0.9636</w:t>
             </w:r>
           </w:p>
         </w:tc>
@@ -14063,7 +14063,7 @@
                 <w:i w:val="0"/>
                 <w:sz w:val="19"/>
               </w:rPr>
-              <w:t>0.1602</w:t>
+              <w:t>0.9333</w:t>
             </w:r>
           </w:p>
         </w:tc>
@@ -14082,7 +14082,7 @@
                 <w:i w:val="0"/>
                 <w:sz w:val="19"/>
               </w:rPr>
-              <w:t>0.2844</w:t>
+              <w:t>0.9609</w:t>
             </w:r>
           </w:p>
         </w:tc>
@@ -14101,7 +14101,7 @@
                 <w:i w:val="0"/>
                 <w:sz w:val="19"/>
               </w:rPr>
-              <w:t>0.5286</w:t>
+              <w:t>0.9800</w:t>
             </w:r>
           </w:p>
         </w:tc>
@@ -14149,7 +14149,7 @@
                 <w:i w:val="0"/>
                 <w:sz w:val="19"/>
               </w:rPr>
-              <w:t>—</w:t>
+              <w:t>0.8267</w:t>
             </w:r>
           </w:p>
         </w:tc>
@@ -14168,7 +14168,7 @@
                 <w:i w:val="0"/>
                 <w:sz w:val="19"/>
               </w:rPr>
-              <w:t>0.2257</w:t>
+              <w:t>0.9807</w:t>
             </w:r>
           </w:p>
         </w:tc>
@@ -14187,7 +14187,7 @@
                 <w:i w:val="0"/>
                 <w:sz w:val="19"/>
               </w:rPr>
-              <w:t>0.1653</w:t>
+              <w:t>0.9347</w:t>
             </w:r>
           </w:p>
         </w:tc>
@@ -14206,7 +14206,7 @@
                 <w:i w:val="0"/>
                 <w:sz w:val="19"/>
               </w:rPr>
-              <w:t>0.2823</w:t>
+              <w:t>0.9523</w:t>
             </w:r>
           </w:p>
         </w:tc>
@@ -14225,7 +14225,7 @@
                 <w:i w:val="0"/>
                 <w:sz w:val="19"/>
               </w:rPr>
-              <w:t>0.5253</w:t>
+              <w:t>0.9785</w:t>
             </w:r>
           </w:p>
         </w:tc>
@@ -14265,7 +14265,7 @@
                 <w:i w:val="0"/>
                 <w:sz w:val="19"/>
               </w:rPr>
-              <w:t>—</w:t>
+              <w:t>0.6327</w:t>
             </w:r>
           </w:p>
         </w:tc>
@@ -14284,7 +14284,7 @@
                 <w:i w:val="0"/>
                 <w:sz w:val="19"/>
               </w:rPr>
-              <w:t>0.2254</w:t>
+              <w:t>0.9484</w:t>
             </w:r>
           </w:p>
         </w:tc>
@@ -14303,7 +14303,7 @@
                 <w:i w:val="0"/>
                 <w:sz w:val="19"/>
               </w:rPr>
-              <w:t>0.1623</w:t>
+              <w:t>0.8889</w:t>
             </w:r>
           </w:p>
         </w:tc>
@@ -14322,7 +14322,7 @@
                 <w:i w:val="0"/>
                 <w:sz w:val="19"/>
               </w:rPr>
-              <w:t>0.2837</w:t>
+              <w:t>0.9524</w:t>
             </w:r>
           </w:p>
         </w:tc>
@@ -14341,7 +14341,7 @@
                 <w:i w:val="0"/>
                 <w:sz w:val="19"/>
               </w:rPr>
-              <w:t>0.5295</w:t>
+              <w:t>0.9748</w:t>
             </w:r>
           </w:p>
         </w:tc>
@@ -14381,7 +14381,7 @@
                 <w:i w:val="0"/>
                 <w:sz w:val="19"/>
               </w:rPr>
-              <w:t>—</w:t>
+              <w:t>0.6889</w:t>
             </w:r>
           </w:p>
         </w:tc>
@@ -14400,7 +14400,7 @@
                 <w:i w:val="0"/>
                 <w:sz w:val="19"/>
               </w:rPr>
-              <w:t>0.2324</w:t>
+              <w:t>0.9594</w:t>
             </w:r>
           </w:p>
         </w:tc>
@@ -14419,7 +14419,7 @@
                 <w:i w:val="0"/>
                 <w:sz w:val="19"/>
               </w:rPr>
-              <w:t>0.1571</w:t>
+              <w:t>0.9190</w:t>
             </w:r>
           </w:p>
         </w:tc>
@@ -14438,7 +14438,7 @@
                 <w:i w:val="0"/>
                 <w:sz w:val="19"/>
               </w:rPr>
-              <w:t>0.2927</w:t>
+              <w:t>0.9656</w:t>
             </w:r>
           </w:p>
         </w:tc>
@@ -14457,7 +14457,7 @@
                 <w:i w:val="0"/>
                 <w:sz w:val="19"/>
               </w:rPr>
-              <w:t>0.5358</w:t>
+              <w:t>0.9750</w:t>
             </w:r>
           </w:p>
         </w:tc>
@@ -14488,7 +14488,7 @@
           <w:b w:val="0"/>
           <w:i w:val="0"/>
         </w:rPr>
-        <w:t xml:space="preserve"> (the physics sanity check) SCEPTRE moves from 0.2138 on the smallest attacks to 0.3037 on the largest — a spread of 0.0899 that the aggregate number conceals entirely.</w:t>
+        <w:t xml:space="preserve"> (the physics sanity check) SCEPTRE moves from 0.9224 on the smallest attacks to 0.9851 on the largest — a spread of 0.0627 that the aggregate number conceals entirely.</w:t>
       </w:r>
     </w:p>
     <w:p>
@@ -14652,7 +14652,7 @@
                 <w:i w:val="0"/>
                 <w:sz w:val="19"/>
               </w:rPr>
-              <w:t>ST-Transformer</w:t>
+              <w:t>MLP (no topology)</w:t>
             </w:r>
           </w:p>
         </w:tc>
@@ -14671,7 +14671,7 @@
                 <w:i w:val="0"/>
                 <w:sz w:val="19"/>
               </w:rPr>
-              <w:t>0.668</w:t>
+              <w:t>0.986</w:t>
             </w:r>
           </w:p>
         </w:tc>
@@ -14784,7 +14784,7 @@
                 <w:i w:val="0"/>
                 <w:sz w:val="19"/>
               </w:rPr>
-              <w:t>Graphormer</w:t>
+              <w:t>BiLSTM</w:t>
             </w:r>
           </w:p>
         </w:tc>
@@ -14803,7 +14803,7 @@
                 <w:i w:val="0"/>
                 <w:sz w:val="19"/>
               </w:rPr>
-              <w:t>0.668</w:t>
+              <w:t>0.982</w:t>
             </w:r>
           </w:p>
         </w:tc>
@@ -14916,7 +14916,7 @@
                 <w:i w:val="0"/>
                 <w:sz w:val="19"/>
               </w:rPr>
-              <w:t>BiLSTM</w:t>
+              <w:t>GCN</w:t>
             </w:r>
           </w:p>
         </w:tc>
@@ -14935,7 +14935,7 @@
                 <w:i w:val="0"/>
                 <w:sz w:val="19"/>
               </w:rPr>
-              <w:t>0.667</w:t>
+              <w:t>0.982</w:t>
             </w:r>
           </w:p>
         </w:tc>
@@ -14950,84 +14950,68 @@
             <w:r/>
             <w:r>
               <w:rPr>
+                <w:b w:val="0"/>
+                <w:i w:val="0"/>
+                <w:sz w:val="19"/>
+              </w:rPr>
+              <w:t>0.744</w:t>
+            </w:r>
+          </w:p>
+        </w:tc>
+        <w:tc>
+          <w:tcPr>
+            <w:tcW w:type="dxa" w:w="1608"/>
+          </w:tcPr>
+          <w:p>
+            <w:pPr>
+              <w:spacing w:after="40"/>
+            </w:pPr>
+            <w:r/>
+            <w:r>
+              <w:rPr>
+                <w:b w:val="0"/>
+                <w:i w:val="0"/>
+                <w:sz w:val="19"/>
+              </w:rPr>
+              <w:t>0.753</w:t>
+            </w:r>
+          </w:p>
+        </w:tc>
+        <w:tc>
+          <w:tcPr>
+            <w:tcW w:type="dxa" w:w="1608"/>
+          </w:tcPr>
+          <w:p>
+            <w:pPr>
+              <w:spacing w:after="40"/>
+            </w:pPr>
+            <w:r/>
+            <w:r>
+              <w:rPr>
+                <w:b w:val="0"/>
+                <w:i w:val="0"/>
+                <w:sz w:val="19"/>
+              </w:rPr>
+              <w:t>0.790</w:t>
+            </w:r>
+          </w:p>
+        </w:tc>
+        <w:tc>
+          <w:tcPr>
+            <w:tcW w:type="dxa" w:w="1608"/>
+          </w:tcPr>
+          <w:p>
+            <w:pPr>
+              <w:spacing w:after="40"/>
+            </w:pPr>
+            <w:r/>
+            <w:r>
+              <w:rPr>
                 <w:b/>
                 <w:i w:val="0"/>
                 <w:sz w:val="19"/>
               </w:rPr>
-              <w:t>n/a</w:t>
-            </w:r>
-          </w:p>
-        </w:tc>
-        <w:tc>
-          <w:tcPr>
-            <w:tcW w:type="dxa" w:w="1608"/>
-          </w:tcPr>
-          <w:p>
-            <w:pPr>
-              <w:spacing w:after="40"/>
-            </w:pPr>
-            <w:r/>
-            <w:r>
-              <w:rPr>
-                <w:b/>
-                <w:i w:val="0"/>
-                <w:sz w:val="19"/>
-              </w:rPr>
-              <w:t>n/a</w:t>
-            </w:r>
-          </w:p>
-        </w:tc>
-        <w:tc>
-          <w:tcPr>
-            <w:tcW w:type="dxa" w:w="1608"/>
-          </w:tcPr>
-          <w:p>
-            <w:pPr>
-              <w:spacing w:after="40"/>
-            </w:pPr>
-            <w:r/>
-            <w:r>
-              <w:rPr>
-                <w:b/>
-                <w:i w:val="0"/>
-                <w:sz w:val="19"/>
-              </w:rPr>
-              <w:t>n/a</w:t>
-            </w:r>
-          </w:p>
-        </w:tc>
-        <w:tc>
-          <w:tcPr>
-            <w:tcW w:type="dxa" w:w="1608"/>
-          </w:tcPr>
-          <w:p>
-            <w:pPr>
-              <w:spacing w:after="40"/>
-            </w:pPr>
-            <w:r/>
-            <w:r>
-              <w:rPr>
-                <w:b w:val="0"/>
-                <w:i w:val="0"/>
-                <w:sz w:val="19"/>
-              </w:rPr>
-              <w:t xml:space="preserve">positional table has </w:t>
-            </w:r>
-            <w:r>
-              <w:rPr>
-                <w:b w:val="0"/>
-                <w:i/>
-                <w:sz w:val="19"/>
-              </w:rPr>
-              <w:t>N</w:t>
-            </w:r>
-            <w:r>
-              <w:rPr>
-                <w:b w:val="0"/>
-                <w:i w:val="0"/>
-                <w:sz w:val="19"/>
-              </w:rPr>
-              <w:t xml:space="preserve"> rows</w:t>
+              <w:t>929,670 — unchanged</w:t>
             </w:r>
           </w:p>
         </w:tc>
@@ -15044,11 +15028,11 @@
             <w:r/>
             <w:r>
               <w:rPr>
-                <w:b w:val="0"/>
-                <w:i w:val="0"/>
-                <w:sz w:val="19"/>
-              </w:rPr>
-              <w:t>KAN</w:t>
+                <w:b/>
+                <w:i w:val="0"/>
+                <w:sz w:val="19"/>
+              </w:rPr>
+              <w:t>SCEPTRE (RSTE)</w:t>
             </w:r>
           </w:p>
         </w:tc>
@@ -15067,7 +15051,7 @@
                 <w:i w:val="0"/>
                 <w:sz w:val="19"/>
               </w:rPr>
-              <w:t>0.666</w:t>
+              <w:t>0.982</w:t>
             </w:r>
           </w:p>
         </w:tc>
@@ -15086,7 +15070,7 @@
                 <w:i w:val="0"/>
                 <w:sz w:val="19"/>
               </w:rPr>
-              <w:t>0.667</w:t>
+              <w:t>0.686</w:t>
             </w:r>
           </w:p>
         </w:tc>
@@ -15105,7 +15089,7 @@
                 <w:i w:val="0"/>
                 <w:sz w:val="19"/>
               </w:rPr>
-              <w:t>0.667</w:t>
+              <w:t>0.713</w:t>
             </w:r>
           </w:p>
         </w:tc>
@@ -15124,7 +15108,7 @@
                 <w:i w:val="0"/>
                 <w:sz w:val="19"/>
               </w:rPr>
-              <w:t>0.661</w:t>
+              <w:t>0.797</w:t>
             </w:r>
           </w:p>
         </w:tc>
@@ -15143,7 +15127,7 @@
                 <w:i w:val="0"/>
                 <w:sz w:val="19"/>
               </w:rPr>
-              <w:t>1,592,071 — unchanged</w:t>
+              <w:t>1,447,110 — unchanged</w:t>
             </w:r>
           </w:p>
         </w:tc>
@@ -15164,7 +15148,7 @@
                 <w:i w:val="0"/>
                 <w:sz w:val="19"/>
               </w:rPr>
-              <w:t>MLP (no topology)</w:t>
+              <w:t>Graphormer</w:t>
             </w:r>
           </w:p>
         </w:tc>
@@ -15183,7 +15167,7 @@
                 <w:i w:val="0"/>
                 <w:sz w:val="19"/>
               </w:rPr>
-              <w:t>0.666</w:t>
+              <w:t>0.981</w:t>
             </w:r>
           </w:p>
         </w:tc>
@@ -15296,15 +15280,7 @@
                 <w:i w:val="0"/>
                 <w:sz w:val="19"/>
               </w:rPr>
-              <w:t xml:space="preserve">MSA3E </w:t>
-            </w:r>
-            <w:r>
-              <w:rPr>
-                <w:b w:val="0"/>
-                <w:i/>
-                <w:sz w:val="19"/>
-              </w:rPr>
-              <w:t>(base paper)</w:t>
+              <w:t>ST-Transformer</w:t>
             </w:r>
           </w:p>
         </w:tc>
@@ -15323,7 +15299,7 @@
                 <w:i w:val="0"/>
                 <w:sz w:val="19"/>
               </w:rPr>
-              <w:t>0.666</w:t>
+              <w:t>0.979</w:t>
             </w:r>
           </w:p>
         </w:tc>
@@ -15432,11 +15408,49 @@
             <w:r/>
             <w:r>
               <w:rPr>
+                <w:b w:val="0"/>
+                <w:i w:val="0"/>
+                <w:sz w:val="19"/>
+              </w:rPr>
+              <w:t>S4 / Mamba-lite</w:t>
+            </w:r>
+          </w:p>
+        </w:tc>
+        <w:tc>
+          <w:tcPr>
+            <w:tcW w:type="dxa" w:w="1608"/>
+          </w:tcPr>
+          <w:p>
+            <w:pPr>
+              <w:spacing w:after="40"/>
+            </w:pPr>
+            <w:r/>
+            <w:r>
+              <w:rPr>
+                <w:b w:val="0"/>
+                <w:i w:val="0"/>
+                <w:sz w:val="19"/>
+              </w:rPr>
+              <w:t>0.979</w:t>
+            </w:r>
+          </w:p>
+        </w:tc>
+        <w:tc>
+          <w:tcPr>
+            <w:tcW w:type="dxa" w:w="1608"/>
+          </w:tcPr>
+          <w:p>
+            <w:pPr>
+              <w:spacing w:after="40"/>
+            </w:pPr>
+            <w:r/>
+            <w:r>
+              <w:rPr>
                 <w:b/>
                 <w:i w:val="0"/>
                 <w:sz w:val="19"/>
               </w:rPr>
-              <w:t>SCEPTRE (RSTE)</w:t>
+              <w:t>n/a</w:t>
             </w:r>
           </w:p>
         </w:tc>
@@ -15451,11 +15465,11 @@
             <w:r/>
             <w:r>
               <w:rPr>
-                <w:b w:val="0"/>
-                <w:i w:val="0"/>
-                <w:sz w:val="19"/>
-              </w:rPr>
-              <w:t>0.665</w:t>
+                <w:b/>
+                <w:i w:val="0"/>
+                <w:sz w:val="19"/>
+              </w:rPr>
+              <w:t>n/a</w:t>
             </w:r>
           </w:p>
         </w:tc>
@@ -15470,11 +15484,11 @@
             <w:r/>
             <w:r>
               <w:rPr>
-                <w:b w:val="0"/>
-                <w:i w:val="0"/>
-                <w:sz w:val="19"/>
-              </w:rPr>
-              <w:t>0.661</w:t>
+                <w:b/>
+                <w:i w:val="0"/>
+                <w:sz w:val="19"/>
+              </w:rPr>
+              <w:t>n/a</w:t>
             </w:r>
           </w:p>
         </w:tc>
@@ -15493,45 +15507,23 @@
                 <w:i w:val="0"/>
                 <w:sz w:val="19"/>
               </w:rPr>
-              <w:t>0.667</w:t>
-            </w:r>
-          </w:p>
-        </w:tc>
-        <w:tc>
-          <w:tcPr>
-            <w:tcW w:type="dxa" w:w="1608"/>
-          </w:tcPr>
-          <w:p>
-            <w:pPr>
-              <w:spacing w:after="40"/>
-            </w:pPr>
-            <w:r/>
-            <w:r>
-              <w:rPr>
-                <w:b w:val="0"/>
-                <w:i w:val="0"/>
-                <w:sz w:val="19"/>
-              </w:rPr>
-              <w:t>0.667</w:t>
-            </w:r>
-          </w:p>
-        </w:tc>
-        <w:tc>
-          <w:tcPr>
-            <w:tcW w:type="dxa" w:w="1608"/>
-          </w:tcPr>
-          <w:p>
-            <w:pPr>
-              <w:spacing w:after="40"/>
-            </w:pPr>
-            <w:r/>
-            <w:r>
-              <w:rPr>
-                <w:b/>
-                <w:i w:val="0"/>
-                <w:sz w:val="19"/>
-              </w:rPr>
-              <w:t>1,447,111 — unchanged</w:t>
+              <w:t xml:space="preserve">positional table has </w:t>
+            </w:r>
+            <w:r>
+              <w:rPr>
+                <w:b w:val="0"/>
+                <w:i/>
+                <w:sz w:val="19"/>
+              </w:rPr>
+              <w:t>N</w:t>
+            </w:r>
+            <w:r>
+              <w:rPr>
+                <w:b w:val="0"/>
+                <w:i w:val="0"/>
+                <w:sz w:val="19"/>
+              </w:rPr>
+              <w:t xml:space="preserve"> rows</w:t>
             </w:r>
           </w:p>
         </w:tc>
@@ -15552,7 +15544,15 @@
                 <w:i w:val="0"/>
                 <w:sz w:val="19"/>
               </w:rPr>
-              <w:t>GCN</w:t>
+              <w:t xml:space="preserve">MSA3E </w:t>
+            </w:r>
+            <w:r>
+              <w:rPr>
+                <w:b w:val="0"/>
+                <w:i/>
+                <w:sz w:val="19"/>
+              </w:rPr>
+              <w:t>(base paper)</w:t>
             </w:r>
           </w:p>
         </w:tc>
@@ -15571,7 +15571,7 @@
                 <w:i w:val="0"/>
                 <w:sz w:val="19"/>
               </w:rPr>
-              <w:t>0.664</w:t>
+              <w:t>0.974</w:t>
             </w:r>
           </w:p>
         </w:tc>
@@ -15586,11 +15586,11 @@
             <w:r/>
             <w:r>
               <w:rPr>
-                <w:b w:val="0"/>
-                <w:i w:val="0"/>
-                <w:sz w:val="19"/>
-              </w:rPr>
-              <w:t>0.662</w:t>
+                <w:b/>
+                <w:i w:val="0"/>
+                <w:sz w:val="19"/>
+              </w:rPr>
+              <w:t>n/a</w:t>
             </w:r>
           </w:p>
         </w:tc>
@@ -15605,11 +15605,11 @@
             <w:r/>
             <w:r>
               <w:rPr>
-                <w:b w:val="0"/>
-                <w:i w:val="0"/>
-                <w:sz w:val="19"/>
-              </w:rPr>
-              <w:t>0.668</w:t>
+                <w:b/>
+                <w:i w:val="0"/>
+                <w:sz w:val="19"/>
+              </w:rPr>
+              <w:t>n/a</w:t>
             </w:r>
           </w:p>
         </w:tc>
@@ -15624,11 +15624,11 @@
             <w:r/>
             <w:r>
               <w:rPr>
-                <w:b w:val="0"/>
-                <w:i w:val="0"/>
-                <w:sz w:val="19"/>
-              </w:rPr>
-              <w:t>0.664</w:t>
+                <w:b/>
+                <w:i w:val="0"/>
+                <w:sz w:val="19"/>
+              </w:rPr>
+              <w:t>n/a</w:t>
             </w:r>
           </w:p>
         </w:tc>
@@ -15643,11 +15643,27 @@
             <w:r/>
             <w:r>
               <w:rPr>
-                <w:b/>
-                <w:i w:val="0"/>
-                <w:sz w:val="19"/>
-              </w:rPr>
-              <w:t>929,671 — unchanged</w:t>
+                <w:b w:val="0"/>
+                <w:i w:val="0"/>
+                <w:sz w:val="19"/>
+              </w:rPr>
+              <w:t xml:space="preserve">positional table has </w:t>
+            </w:r>
+            <w:r>
+              <w:rPr>
+                <w:b w:val="0"/>
+                <w:i/>
+                <w:sz w:val="19"/>
+              </w:rPr>
+              <w:t>N</w:t>
+            </w:r>
+            <w:r>
+              <w:rPr>
+                <w:b w:val="0"/>
+                <w:i w:val="0"/>
+                <w:sz w:val="19"/>
+              </w:rPr>
+              <w:t xml:space="preserve"> rows</w:t>
             </w:r>
           </w:p>
         </w:tc>
@@ -15668,7 +15684,7 @@
                 <w:i w:val="0"/>
                 <w:sz w:val="19"/>
               </w:rPr>
-              <w:t>S4 / Mamba-lite</w:t>
+              <w:t>GAT</w:t>
             </w:r>
           </w:p>
         </w:tc>
@@ -15687,7 +15703,7 @@
                 <w:i w:val="0"/>
                 <w:sz w:val="19"/>
               </w:rPr>
-              <w:t>0.664</w:t>
+              <w:t>0.960</w:t>
             </w:r>
           </w:p>
         </w:tc>
@@ -15702,84 +15718,68 @@
             <w:r/>
             <w:r>
               <w:rPr>
+                <w:b w:val="0"/>
+                <w:i w:val="0"/>
+                <w:sz w:val="19"/>
+              </w:rPr>
+              <w:t>0.702</w:t>
+            </w:r>
+          </w:p>
+        </w:tc>
+        <w:tc>
+          <w:tcPr>
+            <w:tcW w:type="dxa" w:w="1608"/>
+          </w:tcPr>
+          <w:p>
+            <w:pPr>
+              <w:spacing w:after="40"/>
+            </w:pPr>
+            <w:r/>
+            <w:r>
+              <w:rPr>
+                <w:b w:val="0"/>
+                <w:i w:val="0"/>
+                <w:sz w:val="19"/>
+              </w:rPr>
+              <w:t>0.742</w:t>
+            </w:r>
+          </w:p>
+        </w:tc>
+        <w:tc>
+          <w:tcPr>
+            <w:tcW w:type="dxa" w:w="1608"/>
+          </w:tcPr>
+          <w:p>
+            <w:pPr>
+              <w:spacing w:after="40"/>
+            </w:pPr>
+            <w:r/>
+            <w:r>
+              <w:rPr>
+                <w:b w:val="0"/>
+                <w:i w:val="0"/>
+                <w:sz w:val="19"/>
+              </w:rPr>
+              <w:t>0.702</w:t>
+            </w:r>
+          </w:p>
+        </w:tc>
+        <w:tc>
+          <w:tcPr>
+            <w:tcW w:type="dxa" w:w="1608"/>
+          </w:tcPr>
+          <w:p>
+            <w:pPr>
+              <w:spacing w:after="40"/>
+            </w:pPr>
+            <w:r/>
+            <w:r>
+              <w:rPr>
                 <w:b/>
                 <w:i w:val="0"/>
                 <w:sz w:val="19"/>
               </w:rPr>
-              <w:t>n/a</w:t>
-            </w:r>
-          </w:p>
-        </w:tc>
-        <w:tc>
-          <w:tcPr>
-            <w:tcW w:type="dxa" w:w="1608"/>
-          </w:tcPr>
-          <w:p>
-            <w:pPr>
-              <w:spacing w:after="40"/>
-            </w:pPr>
-            <w:r/>
-            <w:r>
-              <w:rPr>
-                <w:b/>
-                <w:i w:val="0"/>
-                <w:sz w:val="19"/>
-              </w:rPr>
-              <w:t>n/a</w:t>
-            </w:r>
-          </w:p>
-        </w:tc>
-        <w:tc>
-          <w:tcPr>
-            <w:tcW w:type="dxa" w:w="1608"/>
-          </w:tcPr>
-          <w:p>
-            <w:pPr>
-              <w:spacing w:after="40"/>
-            </w:pPr>
-            <w:r/>
-            <w:r>
-              <w:rPr>
-                <w:b/>
-                <w:i w:val="0"/>
-                <w:sz w:val="19"/>
-              </w:rPr>
-              <w:t>n/a</w:t>
-            </w:r>
-          </w:p>
-        </w:tc>
-        <w:tc>
-          <w:tcPr>
-            <w:tcW w:type="dxa" w:w="1608"/>
-          </w:tcPr>
-          <w:p>
-            <w:pPr>
-              <w:spacing w:after="40"/>
-            </w:pPr>
-            <w:r/>
-            <w:r>
-              <w:rPr>
-                <w:b w:val="0"/>
-                <w:i w:val="0"/>
-                <w:sz w:val="19"/>
-              </w:rPr>
-              <w:t xml:space="preserve">positional table has </w:t>
-            </w:r>
-            <w:r>
-              <w:rPr>
-                <w:b w:val="0"/>
-                <w:i/>
-                <w:sz w:val="19"/>
-              </w:rPr>
-              <w:t>N</w:t>
-            </w:r>
-            <w:r>
-              <w:rPr>
-                <w:b w:val="0"/>
-                <w:i w:val="0"/>
-                <w:sz w:val="19"/>
-              </w:rPr>
-              <w:t xml:space="preserve"> rows</w:t>
+              <w:t>1,374,342 — unchanged</w:t>
             </w:r>
           </w:p>
         </w:tc>
@@ -15800,7 +15800,7 @@
                 <w:i w:val="0"/>
                 <w:sz w:val="19"/>
               </w:rPr>
-              <w:t>GAT</w:t>
+              <w:t>KAN</w:t>
             </w:r>
           </w:p>
         </w:tc>
@@ -15819,7 +15819,7 @@
                 <w:i w:val="0"/>
                 <w:sz w:val="19"/>
               </w:rPr>
-              <w:t>0.663</w:t>
+              <w:t>0.950</w:t>
             </w:r>
           </w:p>
         </w:tc>
@@ -15838,6 +15838,25 @@
                 <w:i w:val="0"/>
                 <w:sz w:val="19"/>
               </w:rPr>
+              <w:t>0.685</w:t>
+            </w:r>
+          </w:p>
+        </w:tc>
+        <w:tc>
+          <w:tcPr>
+            <w:tcW w:type="dxa" w:w="1608"/>
+          </w:tcPr>
+          <w:p>
+            <w:pPr>
+              <w:spacing w:after="40"/>
+            </w:pPr>
+            <w:r/>
+            <w:r>
+              <w:rPr>
+                <w:b w:val="0"/>
+                <w:i w:val="0"/>
+                <w:sz w:val="19"/>
+              </w:rPr>
               <w:t>0.667</w:t>
             </w:r>
           </w:p>
@@ -15857,7 +15876,7 @@
                 <w:i w:val="0"/>
                 <w:sz w:val="19"/>
               </w:rPr>
-              <w:t>0.667</w:t>
+              <w:t>0.682</w:t>
             </w:r>
           </w:p>
         </w:tc>
@@ -15872,30 +15891,11 @@
             <w:r/>
             <w:r>
               <w:rPr>
-                <w:b w:val="0"/>
-                <w:i w:val="0"/>
-                <w:sz w:val="19"/>
-              </w:rPr>
-              <w:t>0.667</w:t>
-            </w:r>
-          </w:p>
-        </w:tc>
-        <w:tc>
-          <w:tcPr>
-            <w:tcW w:type="dxa" w:w="1608"/>
-          </w:tcPr>
-          <w:p>
-            <w:pPr>
-              <w:spacing w:after="40"/>
-            </w:pPr>
-            <w:r/>
-            <w:r>
-              <w:rPr>
                 <w:b/>
                 <w:i w:val="0"/>
                 <w:sz w:val="19"/>
               </w:rPr>
-              <w:t>1,374,343 — unchanged</w:t>
+              <w:t>1,592,070 — unchanged</w:t>
             </w:r>
           </w:p>
         </w:tc>
@@ -16184,7 +16184,7 @@
                 <w:i w:val="0"/>
                 <w:sz w:val="19"/>
               </w:rPr>
-              <w:t>3.1</w:t>
+              <w:t>14.5</w:t>
             </w:r>
           </w:p>
         </w:tc>
@@ -16222,7 +16222,7 @@
                 <w:i w:val="0"/>
                 <w:sz w:val="19"/>
               </w:rPr>
-              <w:t>4.5×</w:t>
+              <w:t>1.0×</w:t>
             </w:r>
           </w:p>
         </w:tc>
@@ -16241,7 +16241,7 @@
                 <w:i w:val="0"/>
                 <w:sz w:val="19"/>
               </w:rPr>
-              <w:t>0.1323</w:t>
+              <w:t>0.8668</w:t>
             </w:r>
           </w:p>
         </w:tc>
@@ -16260,7 +16260,7 @@
                 <w:i w:val="0"/>
                 <w:sz w:val="19"/>
               </w:rPr>
-              <w:t>0.1235</w:t>
+              <w:t>0.8677</w:t>
             </w:r>
           </w:p>
         </w:tc>
@@ -16279,7 +16279,7 @@
                 <w:i w:val="0"/>
                 <w:sz w:val="19"/>
               </w:rPr>
-              <w:t>0.409</w:t>
+              <w:t>0.231</w:t>
             </w:r>
           </w:p>
         </w:tc>
@@ -16298,7 +16298,7 @@
                 <w:i w:val="0"/>
                 <w:sz w:val="19"/>
               </w:rPr>
-              <w:t>0.422</w:t>
+              <w:t>0.229</w:t>
             </w:r>
           </w:p>
         </w:tc>
@@ -16357,7 +16357,7 @@
                 <w:i w:val="0"/>
                 <w:sz w:val="19"/>
               </w:rPr>
-              <w:t>3.5</w:t>
+              <w:t>19.2</w:t>
             </w:r>
           </w:p>
         </w:tc>
@@ -16395,7 +16395,7 @@
                 <w:i w:val="0"/>
                 <w:sz w:val="19"/>
               </w:rPr>
-              <w:t>8.5×</w:t>
+              <w:t>1.6×</w:t>
             </w:r>
           </w:p>
         </w:tc>
@@ -16414,7 +16414,7 @@
                 <w:i w:val="0"/>
                 <w:sz w:val="19"/>
               </w:rPr>
-              <w:t>0.0282</w:t>
+              <w:t>0.5290</w:t>
             </w:r>
           </w:p>
         </w:tc>
@@ -16433,7 +16433,7 @@
                 <w:i w:val="0"/>
                 <w:sz w:val="19"/>
               </w:rPr>
-              <w:t>0.0256</w:t>
+              <w:t>0.5310</w:t>
             </w:r>
           </w:p>
         </w:tc>
@@ -16452,7 +16452,7 @@
                 <w:i w:val="0"/>
                 <w:sz w:val="19"/>
               </w:rPr>
-              <w:t>0.811</w:t>
+              <w:t>0.481</w:t>
             </w:r>
           </w:p>
         </w:tc>
@@ -16471,7 +16471,7 @@
                 <w:i w:val="0"/>
                 <w:sz w:val="19"/>
               </w:rPr>
-              <w:t>0.822</w:t>
+              <w:t>0.483</w:t>
             </w:r>
           </w:p>
         </w:tc>
@@ -16530,7 +16530,7 @@
                 <w:i w:val="0"/>
                 <w:sz w:val="19"/>
               </w:rPr>
-              <w:t>6.9</w:t>
+              <w:t>5.5</w:t>
             </w:r>
           </w:p>
         </w:tc>
@@ -16568,7 +16568,7 @@
                 <w:i w:val="0"/>
                 <w:sz w:val="19"/>
               </w:rPr>
-              <w:t>8.3×</w:t>
+              <w:t>10.4×</w:t>
             </w:r>
           </w:p>
         </w:tc>
@@ -16587,7 +16587,7 @@
                 <w:i w:val="0"/>
                 <w:sz w:val="19"/>
               </w:rPr>
-              <w:t>0.0563</w:t>
+              <w:t>0.0511</w:t>
             </w:r>
           </w:p>
         </w:tc>
@@ -16606,7 +16606,7 @@
                 <w:i w:val="0"/>
                 <w:sz w:val="19"/>
               </w:rPr>
-              <w:t>0.0357</w:t>
+              <w:t>0.0924</w:t>
             </w:r>
           </w:p>
         </w:tc>
@@ -16625,7 +16625,7 @@
                 <w:i w:val="0"/>
                 <w:sz w:val="19"/>
               </w:rPr>
-              <w:t>0.713</w:t>
+              <w:t>0.617</w:t>
             </w:r>
           </w:p>
         </w:tc>
@@ -16644,7 +16644,7 @@
                 <w:i w:val="0"/>
                 <w:sz w:val="19"/>
               </w:rPr>
-              <w:t>0.774</w:t>
+              <w:t>0.686</w:t>
             </w:r>
           </w:p>
         </w:tc>
@@ -16703,7 +16703,7 @@
                 <w:i w:val="0"/>
                 <w:sz w:val="19"/>
               </w:rPr>
-              <w:t>17.2</w:t>
+              <w:t>1.8</w:t>
             </w:r>
           </w:p>
         </w:tc>
@@ -16741,7 +16741,7 @@
                 <w:i w:val="0"/>
                 <w:sz w:val="19"/>
               </w:rPr>
-              <w:t>6.9×</w:t>
+              <w:t>65.4×</w:t>
             </w:r>
           </w:p>
         </w:tc>
@@ -16760,7 +16760,7 @@
                 <w:i w:val="0"/>
                 <w:sz w:val="19"/>
               </w:rPr>
-              <w:t>0.1359</w:t>
+              <w:t>0.0044</w:t>
             </w:r>
           </w:p>
         </w:tc>
@@ -16779,7 +16779,7 @@
                 <w:i w:val="0"/>
                 <w:sz w:val="19"/>
               </w:rPr>
-              <w:t>0.1528</w:t>
+              <w:t>0.0185</w:t>
             </w:r>
           </w:p>
         </w:tc>
@@ -16798,7 +16798,7 @@
                 <w:i w:val="0"/>
                 <w:sz w:val="19"/>
               </w:rPr>
-              <w:t>0.661</w:t>
+              <w:t>0.836</w:t>
             </w:r>
           </w:p>
         </w:tc>
@@ -16817,7 +16817,7 @@
                 <w:i w:val="0"/>
                 <w:sz w:val="19"/>
               </w:rPr>
-              <w:t>0.710</w:t>
+              <w:t>0.855</w:t>
             </w:r>
           </w:p>
         </w:tc>
@@ -17172,7 +17172,7 @@
                 <w:i w:val="0"/>
                 <w:sz w:val="19"/>
               </w:rPr>
-              <w:t>0.845</w:t>
+              <w:t>0.993</w:t>
             </w:r>
           </w:p>
         </w:tc>
@@ -17191,7 +17191,7 @@
                 <w:i w:val="0"/>
                 <w:sz w:val="19"/>
               </w:rPr>
-              <w:t>0.843</w:t>
+              <w:t>0.983</w:t>
             </w:r>
           </w:p>
         </w:tc>
@@ -17210,7 +17210,7 @@
                 <w:i w:val="0"/>
                 <w:sz w:val="19"/>
               </w:rPr>
-              <w:t>0.838</w:t>
+              <w:t>0.910</w:t>
             </w:r>
           </w:p>
         </w:tc>
@@ -17229,7 +17229,7 @@
                 <w:i w:val="0"/>
                 <w:sz w:val="19"/>
               </w:rPr>
-              <w:t>0.828</w:t>
+              <w:t>0.485</w:t>
             </w:r>
           </w:p>
         </w:tc>
@@ -17248,7 +17248,7 @@
                 <w:i w:val="0"/>
                 <w:sz w:val="19"/>
               </w:rPr>
-              <w:t>0.833</w:t>
+              <w:t>0.158</w:t>
             </w:r>
           </w:p>
         </w:tc>
@@ -17267,7 +17267,7 @@
                 <w:i w:val="0"/>
                 <w:sz w:val="19"/>
               </w:rPr>
-              <w:t>0.802</w:t>
+              <w:t>0.062</w:t>
             </w:r>
           </w:p>
         </w:tc>
@@ -17286,7 +17286,7 @@
                 <w:i w:val="0"/>
                 <w:sz w:val="19"/>
               </w:rPr>
-              <w:t>0.828</w:t>
+              <w:t>0.072</w:t>
             </w:r>
           </w:p>
         </w:tc>
@@ -17305,7 +17305,7 @@
                 <w:i w:val="0"/>
                 <w:sz w:val="19"/>
               </w:rPr>
-              <w:t>0.790</w:t>
+              <w:t>0.043</w:t>
             </w:r>
           </w:p>
         </w:tc>
@@ -17324,7 +17324,7 @@
                 <w:i w:val="0"/>
                 <w:sz w:val="19"/>
               </w:rPr>
-              <w:t>—</w:t>
+              <w:t>1.300</w:t>
             </w:r>
           </w:p>
         </w:tc>
@@ -17364,7 +17364,7 @@
                 <w:i w:val="0"/>
                 <w:sz w:val="19"/>
               </w:rPr>
-              <w:t>0.925</w:t>
+              <w:t>0.965</w:t>
             </w:r>
           </w:p>
         </w:tc>
@@ -17383,7 +17383,7 @@
                 <w:i w:val="0"/>
                 <w:sz w:val="19"/>
               </w:rPr>
-              <w:t>0.922</w:t>
+              <w:t>0.895</w:t>
             </w:r>
           </w:p>
         </w:tc>
@@ -17402,7 +17402,7 @@
                 <w:i w:val="0"/>
                 <w:sz w:val="19"/>
               </w:rPr>
-              <w:t>0.922</w:t>
+              <w:t>0.618</w:t>
             </w:r>
           </w:p>
         </w:tc>
@@ -17421,7 +17421,7 @@
                 <w:i w:val="0"/>
                 <w:sz w:val="19"/>
               </w:rPr>
-              <w:t>0.922</w:t>
+              <w:t>0.260</w:t>
             </w:r>
           </w:p>
         </w:tc>
@@ -17440,7 +17440,7 @@
                 <w:i w:val="0"/>
                 <w:sz w:val="19"/>
               </w:rPr>
-              <w:t>0.925</w:t>
+              <w:t>0.100</w:t>
             </w:r>
           </w:p>
         </w:tc>
@@ -17459,7 +17459,7 @@
                 <w:i w:val="0"/>
                 <w:sz w:val="19"/>
               </w:rPr>
-              <w:t>0.935</w:t>
+              <w:t>0.077</w:t>
             </w:r>
           </w:p>
         </w:tc>
@@ -17478,7 +17478,7 @@
                 <w:i w:val="0"/>
                 <w:sz w:val="19"/>
               </w:rPr>
-              <w:t>0.932</w:t>
+              <w:t>0.015</w:t>
             </w:r>
           </w:p>
         </w:tc>
@@ -17497,7 +17497,7 @@
                 <w:i w:val="0"/>
                 <w:sz w:val="19"/>
               </w:rPr>
-              <w:t>0.945</w:t>
+              <w:t>0.007</w:t>
             </w:r>
           </w:p>
         </w:tc>
@@ -17516,7 +17516,7 @@
                 <w:i w:val="0"/>
                 <w:sz w:val="19"/>
               </w:rPr>
-              <w:t>—</w:t>
+              <w:t>0.850</w:t>
             </w:r>
           </w:p>
         </w:tc>
@@ -17556,7 +17556,7 @@
                 <w:i w:val="0"/>
                 <w:sz w:val="19"/>
               </w:rPr>
-              <w:t>0.973</w:t>
+              <w:t>1.000</w:t>
             </w:r>
           </w:p>
         </w:tc>
@@ -17575,7 +17575,7 @@
                 <w:i w:val="0"/>
                 <w:sz w:val="19"/>
               </w:rPr>
-              <w:t>0.975</w:t>
+              <w:t>1.000</w:t>
             </w:r>
           </w:p>
         </w:tc>
@@ -17594,7 +17594,7 @@
                 <w:i w:val="0"/>
                 <w:sz w:val="19"/>
               </w:rPr>
-              <w:t>0.968</w:t>
+              <w:t>1.000</w:t>
             </w:r>
           </w:p>
         </w:tc>
@@ -17613,7 +17613,7 @@
                 <w:i w:val="0"/>
                 <w:sz w:val="19"/>
               </w:rPr>
-              <w:t>0.970</w:t>
+              <w:t>1.000</w:t>
             </w:r>
           </w:p>
         </w:tc>
@@ -17632,7 +17632,7 @@
                 <w:i w:val="0"/>
                 <w:sz w:val="19"/>
               </w:rPr>
-              <w:t>0.955</w:t>
+              <w:t>1.000</w:t>
             </w:r>
           </w:p>
         </w:tc>
@@ -17651,7 +17651,7 @@
                 <w:i w:val="0"/>
                 <w:sz w:val="19"/>
               </w:rPr>
-              <w:t>0.950</w:t>
+              <w:t>1.000</w:t>
             </w:r>
           </w:p>
         </w:tc>
@@ -17670,7 +17670,7 @@
                 <w:i w:val="0"/>
                 <w:sz w:val="19"/>
               </w:rPr>
-              <w:t>0.917</w:t>
+              <w:t>0.998</w:t>
             </w:r>
           </w:p>
         </w:tc>
@@ -17689,7 +17689,7 @@
                 <w:i w:val="0"/>
                 <w:sz w:val="19"/>
               </w:rPr>
-              <w:t>0.910</w:t>
+              <w:t>0.995</w:t>
             </w:r>
           </w:p>
         </w:tc>
@@ -19403,7 +19403,7 @@
                 <w:i w:val="0"/>
                 <w:sz w:val="19"/>
               </w:rPr>
-              <w:t>0.6638 ± 0.0020</w:t>
+              <w:t>0.9481 ± 0.0384</w:t>
             </w:r>
           </w:p>
         </w:tc>
@@ -19422,7 +19422,7 @@
                 <w:i w:val="0"/>
                 <w:sz w:val="19"/>
               </w:rPr>
-              <w:t>0.5686 ± 0.0005</w:t>
+              <w:t>0.8640 ± 0.0554</w:t>
             </w:r>
           </w:p>
         </w:tc>
@@ -19441,7 +19441,7 @@
                 <w:i w:val="0"/>
                 <w:sz w:val="19"/>
               </w:rPr>
-              <w:t>0.1734</w:t>
+              <w:t>0.0333</w:t>
             </w:r>
           </w:p>
         </w:tc>
@@ -19460,7 +19460,7 @@
                 <w:i w:val="0"/>
                 <w:sz w:val="19"/>
               </w:rPr>
-              <w:t>15.78</w:t>
+              <w:t>15.32</w:t>
             </w:r>
           </w:p>
         </w:tc>
@@ -19500,7 +19500,7 @@
                 <w:i w:val="0"/>
                 <w:sz w:val="19"/>
               </w:rPr>
-              <w:t>0.6791 ± 0.0108</w:t>
+              <w:t>0.9822 ± 0.0006</w:t>
             </w:r>
           </w:p>
         </w:tc>
@@ -19519,7 +19519,7 @@
                 <w:i w:val="0"/>
                 <w:sz w:val="19"/>
               </w:rPr>
-              <w:t>0.5722 ± 0.0042</w:t>
+              <w:t>0.8332 ± 0.0017</w:t>
             </w:r>
           </w:p>
         </w:tc>
@@ -19538,7 +19538,7 @@
                 <w:i w:val="0"/>
                 <w:sz w:val="19"/>
               </w:rPr>
-              <w:t>0.2411</w:t>
+              <w:t>0.0304</w:t>
             </w:r>
           </w:p>
         </w:tc>
@@ -19557,7 +19557,7 @@
                 <w:i w:val="0"/>
                 <w:sz w:val="19"/>
               </w:rPr>
-              <w:t>14.37</w:t>
+              <w:t>13.81</w:t>
             </w:r>
           </w:p>
         </w:tc>
@@ -19597,7 +19597,7 @@
                 <w:i w:val="0"/>
                 <w:sz w:val="19"/>
               </w:rPr>
-              <w:t>0.6676 ± 0.0011</w:t>
+              <w:t>0.9849 ± 0.0004</w:t>
             </w:r>
           </w:p>
         </w:tc>
@@ -19616,7 +19616,7 @@
                 <w:i w:val="0"/>
                 <w:sz w:val="19"/>
               </w:rPr>
-              <w:t>0.5726 ± 0.0022</w:t>
+              <w:t>0.9095 ± 0.0042</w:t>
             </w:r>
           </w:p>
         </w:tc>
@@ -19635,7 +19635,7 @@
                 <w:i w:val="0"/>
                 <w:sz w:val="19"/>
               </w:rPr>
-              <w:t>0.1758</w:t>
+              <w:t>0.0300</w:t>
             </w:r>
           </w:p>
         </w:tc>
@@ -19654,7 +19654,7 @@
                 <w:i w:val="0"/>
                 <w:sz w:val="19"/>
               </w:rPr>
-              <w:t>14.96</w:t>
+              <w:t>14.56</w:t>
             </w:r>
           </w:p>
         </w:tc>
@@ -19694,7 +19694,7 @@
                 <w:i w:val="0"/>
                 <w:sz w:val="19"/>
               </w:rPr>
-              <w:t>0.6641 ± 0.0020</w:t>
+              <w:t>0.9814 ± 0.0022</w:t>
             </w:r>
           </w:p>
         </w:tc>
@@ -19713,7 +19713,7 @@
                 <w:i w:val="0"/>
                 <w:sz w:val="19"/>
               </w:rPr>
-              <w:t>0.5677 ± 0.0011</w:t>
+              <w:t>0.9208 ± 0.0038</w:t>
             </w:r>
           </w:p>
         </w:tc>
@@ -19732,7 +19732,7 @@
                 <w:i w:val="0"/>
                 <w:sz w:val="19"/>
               </w:rPr>
-              <w:t>0.1722</w:t>
+              <w:t>0.0323</w:t>
             </w:r>
           </w:p>
         </w:tc>
@@ -19751,7 +19751,7 @@
                 <w:i w:val="0"/>
                 <w:sz w:val="19"/>
               </w:rPr>
-              <w:t>16.72</w:t>
+              <w:t>15.74</w:t>
             </w:r>
           </w:p>
         </w:tc>
@@ -19791,7 +19791,7 @@
                 <w:i w:val="0"/>
                 <w:sz w:val="19"/>
               </w:rPr>
-              <w:t>0.6646 ± 0.0009</w:t>
+              <w:t>0.9835 ± 0.0018</w:t>
             </w:r>
           </w:p>
         </w:tc>
@@ -19810,7 +19810,7 @@
                 <w:i w:val="0"/>
                 <w:sz w:val="19"/>
               </w:rPr>
-              <w:t>0.5685 ± 0.0020</w:t>
+              <w:t>0.9025 ± 0.0086</w:t>
             </w:r>
           </w:p>
         </w:tc>
@@ -19829,7 +19829,7 @@
                 <w:i w:val="0"/>
                 <w:sz w:val="19"/>
               </w:rPr>
-              <w:t>0.1723</w:t>
+              <w:t>0.0333</w:t>
             </w:r>
           </w:p>
         </w:tc>
@@ -19848,7 +19848,7 @@
                 <w:i w:val="0"/>
                 <w:sz w:val="19"/>
               </w:rPr>
-              <w:t>15.72</w:t>
+              <w:t>15.02</w:t>
             </w:r>
           </w:p>
         </w:tc>
@@ -19888,7 +19888,7 @@
                 <w:i w:val="0"/>
                 <w:sz w:val="19"/>
               </w:rPr>
-              <w:t>0.6650 ± 0.0002</w:t>
+              <w:t>0.9814 ± 0.0010</w:t>
             </w:r>
           </w:p>
         </w:tc>
@@ -19907,7 +19907,7 @@
                 <w:i w:val="0"/>
                 <w:sz w:val="19"/>
               </w:rPr>
-              <w:t>0.5699 ± 0.0019</w:t>
+              <w:t>0.9058 ± 0.0035</w:t>
             </w:r>
           </w:p>
         </w:tc>
@@ -19926,7 +19926,7 @@
                 <w:i w:val="0"/>
                 <w:sz w:val="19"/>
               </w:rPr>
-              <w:t>0.1764</w:t>
+              <w:t>0.0308</w:t>
             </w:r>
           </w:p>
         </w:tc>
@@ -19945,7 +19945,7 @@
                 <w:i w:val="0"/>
                 <w:sz w:val="19"/>
               </w:rPr>
-              <w:t>15.99</w:t>
+              <w:t>15.15</w:t>
             </w:r>
           </w:p>
         </w:tc>
@@ -19985,7 +19985,7 @@
                 <w:i w:val="0"/>
                 <w:sz w:val="19"/>
               </w:rPr>
-              <w:t>0.6651 ± 0.0008</w:t>
+              <w:t>0.9831 ± 0.0027</w:t>
             </w:r>
           </w:p>
         </w:tc>
@@ -20004,7 +20004,7 @@
                 <w:i w:val="0"/>
                 <w:sz w:val="19"/>
               </w:rPr>
-              <w:t>0.5695 ± 0.0010</w:t>
+              <w:t>0.9116 ± 0.0020</w:t>
             </w:r>
           </w:p>
         </w:tc>
@@ -20023,7 +20023,7 @@
                 <w:i w:val="0"/>
                 <w:sz w:val="19"/>
               </w:rPr>
-              <w:t>0.1712</w:t>
+              <w:t>0.0318</w:t>
             </w:r>
           </w:p>
         </w:tc>
@@ -20042,7 +20042,7 @@
                 <w:i w:val="0"/>
                 <w:sz w:val="19"/>
               </w:rPr>
-              <w:t>15.88</w:t>
+              <w:t>15.27</w:t>
             </w:r>
           </w:p>
         </w:tc>
@@ -20073,7 +20073,7 @@
           <w:b w:val="0"/>
           <w:i w:val="0"/>
         </w:rPr>
-        <w:t>: same depth, same parameter count, differing only in whether the partition respects the electrical structure. Full SCEPTRE 0.6638 vs 0.6651 (-0.0013).</w:t>
+        <w:t>: same depth, same parameter count, differing only in whether the partition respects the electrical structure. Full SCEPTRE 0.9481 vs 0.9831 (-0.0349).</w:t>
       </w:r>
     </w:p>
     <w:p>

</xml_diff>